<commit_message>
Convert student-facing material to American spelling
Repo-wide spelling pass in the private course repo, synced here. Affects
the lab guides, worksheets, the §4 handouts, the memo rubric, and L04's
.eml fixtures — including one Briticism inside a base64-encoded email
attachment, whose correction changed that lab's attachment digest.

Synced from the private course repo by tools/sync_student_repo.py
(explicit allowlist + taint scan).

Co-Authored-By: Claude Opus 5 <noreply@anthropic.com>
Claude-Session: https://claude.ai/code/session_01Ndg2CMGYP55mHaDwZmyGqs
</commit_message>
<xml_diff>
--- a/labs/L04_Phishing_Anatomy/L04_Worksheet.docx
+++ b/labs/L04_Phishing_Anatomy/L04_Worksheet.docx
@@ -47,7 +47,7 @@
         <w:t>as you go</w:t>
       </w:r>
       <w:r>
-        <w:t xml:space="preserve"> — several questions ask for the exact header line you based a verdict on, which is much harder to reconstruct afterwards.</w:t>
+        <w:t xml:space="preserve"> — several questions ask for the exact header line you based a verdict on, which is much harder to reconstruct afterward.</w:t>
       </w:r>
     </w:p>
     <w:p>
@@ -681,7 +681,7 @@
         <w:rPr>
           <w:b/>
         </w:rPr>
-        <w:t>your own organisation controls</w:t>
+        <w:t>your own organization controls</w:t>
       </w:r>
       <w:r>
         <w:t xml:space="preserve"> — the top one or the bottom one? Why does that make it harder to forge than the </w:t>

</xml_diff>